<commit_message>
Add all remaining changes
</commit_message>
<xml_diff>
--- a/CSharp_Final_Report_Questions.docx
+++ b/CSharp_Final_Report_Questions.docx
@@ -7,8 +7,10 @@
         <w:pStyle w:val="36"/>
       </w:pPr>
       <w:r>
-        <w:t>C# Final Report Assignment (Updated Question Set)</w:t>
+        <w:t>C# Final Report Assignment</w:t>
       </w:r>
+      <w:bookmarkStart w:id="0" w:name="_GoBack"/>
+      <w:bookmarkEnd w:id="0"/>
     </w:p>
     <w:p>
       <w:pPr>
@@ -239,7 +241,6 @@
       <w:pPr>
         <w:pStyle w:val="29"/>
       </w:pPr>
-      <w:bookmarkStart w:id="0" w:name="_GoBack"/>
       <w:r>
         <w:t>Write a C# program to reverse a string entered by the user.</w:t>
       </w:r>
@@ -296,7 +297,6 @@
         <w:t>Write a lambda expression to check if a given string starts with the letter 'A'.</w:t>
       </w:r>
     </w:p>
-    <w:bookmarkEnd w:id="0"/>
     <w:p>
       <w:pPr>
         <w:pStyle w:val="2"/>
@@ -569,6 +569,7 @@
       <w:pPr>
         <w:pStyle w:val="23"/>
         <w:numPr>
+          <w:ilvl w:val="0"/>
           <w:numId w:val="0"/>
         </w:numPr>
         <w:ind w:leftChars="0"/>
@@ -888,7 +889,7 @@
     <w:lsdException w:uiPriority="99" w:name="HTML Sample"/>
     <w:lsdException w:uiPriority="99" w:name="HTML Typewriter"/>
     <w:lsdException w:uiPriority="99" w:name="HTML Variable"/>
-    <w:lsdException w:uiPriority="99" w:name="Normal Table"/>
+    <w:lsdException w:qFormat="1" w:uiPriority="99" w:name="Normal Table"/>
     <w:lsdException w:uiPriority="99" w:name="annotation subject"/>
     <w:lsdException w:uiPriority="99" w:name="Table Simple 1"/>
     <w:lsdException w:uiPriority="99" w:name="Table Simple 2"/>
@@ -948,7 +949,7 @@
     <w:lsdException w:unhideWhenUsed="0" w:uiPriority="69" w:semiHidden="0" w:name="Medium Grid 3"/>
     <w:lsdException w:unhideWhenUsed="0" w:uiPriority="70" w:semiHidden="0" w:name="Dark List"/>
     <w:lsdException w:unhideWhenUsed="0" w:uiPriority="71" w:semiHidden="0" w:name="Colorful Shading"/>
-    <w:lsdException w:unhideWhenUsed="0" w:uiPriority="72" w:semiHidden="0" w:name="Colorful List"/>
+    <w:lsdException w:qFormat="1" w:unhideWhenUsed="0" w:uiPriority="72" w:semiHidden="0" w:name="Colorful List"/>
     <w:lsdException w:unhideWhenUsed="0" w:uiPriority="73" w:semiHidden="0" w:name="Colorful Grid"/>
     <w:lsdException w:unhideWhenUsed="0" w:uiPriority="60" w:semiHidden="0" w:name="Light Shading Accent 1"/>
     <w:lsdException w:unhideWhenUsed="0" w:uiPriority="61" w:semiHidden="0" w:name="Light List Accent 1"/>
@@ -961,7 +962,7 @@
     <w:lsdException w:qFormat="1" w:unhideWhenUsed="0" w:uiPriority="30" w:semiHidden="0" w:name="Intense Quote"/>
     <w:lsdException w:unhideWhenUsed="0" w:uiPriority="66" w:semiHidden="0" w:name="Medium List 2 Accent 1"/>
     <w:lsdException w:unhideWhenUsed="0" w:uiPriority="67" w:semiHidden="0" w:name="Medium Grid 1 Accent 1"/>
-    <w:lsdException w:unhideWhenUsed="0" w:uiPriority="68" w:semiHidden="0" w:name="Medium Grid 2 Accent 1"/>
+    <w:lsdException w:qFormat="1" w:unhideWhenUsed="0" w:uiPriority="68" w:semiHidden="0" w:name="Medium Grid 2 Accent 1"/>
     <w:lsdException w:unhideWhenUsed="0" w:uiPriority="69" w:semiHidden="0" w:name="Medium Grid 3 Accent 1"/>
     <w:lsdException w:unhideWhenUsed="0" w:uiPriority="70" w:semiHidden="0" w:name="Dark List Accent 1"/>
     <w:lsdException w:unhideWhenUsed="0" w:uiPriority="71" w:semiHidden="0" w:name="Colorful Shading Accent 1"/>
@@ -1016,11 +1017,11 @@
     <w:lsdException w:unhideWhenUsed="0" w:uiPriority="64" w:semiHidden="0" w:name="Medium Shading 2 Accent 5"/>
     <w:lsdException w:unhideWhenUsed="0" w:uiPriority="65" w:semiHidden="0" w:name="Medium List 1 Accent 5"/>
     <w:lsdException w:unhideWhenUsed="0" w:uiPriority="66" w:semiHidden="0" w:name="Medium List 2 Accent 5"/>
-    <w:lsdException w:unhideWhenUsed="0" w:uiPriority="67" w:semiHidden="0" w:name="Medium Grid 1 Accent 5"/>
+    <w:lsdException w:qFormat="1" w:unhideWhenUsed="0" w:uiPriority="67" w:semiHidden="0" w:name="Medium Grid 1 Accent 5"/>
     <w:lsdException w:unhideWhenUsed="0" w:uiPriority="68" w:semiHidden="0" w:name="Medium Grid 2 Accent 5"/>
     <w:lsdException w:unhideWhenUsed="0" w:uiPriority="69" w:semiHidden="0" w:name="Medium Grid 3 Accent 5"/>
     <w:lsdException w:unhideWhenUsed="0" w:uiPriority="70" w:semiHidden="0" w:name="Dark List Accent 5"/>
-    <w:lsdException w:unhideWhenUsed="0" w:uiPriority="71" w:semiHidden="0" w:name="Colorful Shading Accent 5"/>
+    <w:lsdException w:qFormat="1" w:unhideWhenUsed="0" w:uiPriority="71" w:semiHidden="0" w:name="Colorful Shading Accent 5"/>
     <w:lsdException w:unhideWhenUsed="0" w:uiPriority="72" w:semiHidden="0" w:name="Colorful List Accent 5"/>
     <w:lsdException w:unhideWhenUsed="0" w:uiPriority="73" w:semiHidden="0" w:name="Colorful Grid Accent 5"/>
     <w:lsdException w:unhideWhenUsed="0" w:uiPriority="60" w:semiHidden="0" w:name="Light Shading Accent 6"/>
@@ -1298,6 +1299,7 @@
     <w:name w:val="Normal Table"/>
     <w:semiHidden/>
     <w:unhideWhenUsed/>
+    <w:qFormat/>
     <w:uiPriority w:val="99"/>
     <w:tblPr>
       <w:tblCellMar>
@@ -7659,6 +7661,7 @@
   <w:style w:type="table" w:styleId="91">
     <w:name w:val="Medium Grid 1 Accent 5"/>
     <w:basedOn w:val="12"/>
+    <w:qFormat/>
     <w:uiPriority w:val="67"/>
     <w:pPr>
       <w:spacing w:after="0" w:line="240" w:lineRule="auto"/>
@@ -7943,6 +7946,7 @@
   <w:style w:type="table" w:styleId="94">
     <w:name w:val="Medium Grid 2 Accent 1"/>
     <w:basedOn w:val="12"/>
+    <w:qFormat/>
     <w:uiPriority w:val="68"/>
     <w:pPr>
       <w:spacing w:after="0" w:line="240" w:lineRule="auto"/>
@@ -11443,6 +11447,7 @@
   <w:style w:type="table" w:styleId="119">
     <w:name w:val="Colorful Shading Accent 5"/>
     <w:basedOn w:val="12"/>
+    <w:qFormat/>
     <w:uiPriority w:val="71"/>
     <w:pPr>
       <w:spacing w:after="0" w:line="240" w:lineRule="auto"/>
@@ -11739,6 +11744,7 @@
   <w:style w:type="table" w:styleId="121">
     <w:name w:val="Colorful List"/>
     <w:basedOn w:val="12"/>
+    <w:qFormat/>
     <w:uiPriority w:val="72"/>
     <w:pPr>
       <w:spacing w:after="0" w:line="240" w:lineRule="auto"/>

</xml_diff>